<commit_message>
Auto commit (2026-10-07 12:40) — 3 changes
Claude Code 세션 종료 시 자동 커밋.

Co-Authored-By: Claude <noreply@anthropic.com>
</commit_message>
<xml_diff>
--- a/projects/32_this_life_ill_protect_you/32_this_life_ill_protect_you_EP01-50_v020.docx
+++ b/projects/32_this_life_ill_protect_you/32_this_life_ill_protect_you_EP01-50_v020.docx
@@ -14589,7 +14589,18 @@
           <w:i w:val="0"/>
           <w:color w:val="000000"/>
         </w:rPr>
-        <w:t>새파랗게 질린 그레이스가 고개를 젓고, 라이언이 대니얼을 보며 어깨를 으쓱 해보이면, 대니얼, 휴대폰을 흥미롭게 바라보다가 그대로 떨어뜨리고 발로 짓밟아 버리는데. 그 때, 딘이 다급히 회의실 안으로 들어온다.</w:t>
+        <w:t>새파랗게 질린 그레이스가 고개를 젓고, 라이언이 대니얼을 보며 어깨를 으쓱 해보이면, 대니얼, 휴대폰을 흥미롭게 바라보다가 그대로 떨어뜨리고 발로 짓밟아 버리는데.</w:t>
+      </w:r>
+    </w:p>
+    <w:p>
+      <w:r>
+        <w:rPr>
+          <w:rFonts w:ascii="Malgun Gothic" w:hAnsi="Malgun Gothic" w:eastAsia="Malgun Gothic"/>
+          <w:b w:val="0"/>
+          <w:i w:val="0"/>
+          <w:color w:val="000000"/>
+        </w:rPr>
+        <w:t>그 때, 딘이 다급히 회의실 안으로 들어온다.</w:t>
       </w:r>
     </w:p>
     <w:p>
@@ -16819,9 +16830,24 @@
     </w:p>
     <w:p>
       <w:pPr>
-        <w:tabs>
-          <w:tab w:pos="1474" w:val="left"/>
-        </w:tabs>
+        <w:spacing w:before="200"/>
+      </w:pPr>
+      <w:r>
+        <w:rPr>
+          <w:rFonts w:ascii="Malgun Gothic" w:hAnsi="Malgun Gothic" w:eastAsia="Malgun Gothic"/>
+          <w:b w:val="0"/>
+          <w:i w:val="0"/>
+          <w:color w:val="000000"/>
+        </w:rPr>
+        <w:t>대니얼이 질겁해 루시를 밀쳐내려는 순간.</w:t>
+      </w:r>
+    </w:p>
+    <w:p>
+      <w:pPr>
+        <w:tabs>
+          <w:tab w:pos="1474" w:val="left"/>
+        </w:tabs>
+        <w:spacing w:before="200"/>
         <w:ind w:left="1474" w:hanging="1474"/>
       </w:pPr>
       <w:r>
@@ -20338,7 +20364,7 @@
           <w:i w:val="0"/>
           <w:color w:val="0070C0"/>
         </w:rPr>
-        <w:t xml:space="preserve"> 로버트가 그 여자랑 노는 영상, 저 사람한테 받았어요.</w:t>
+        <w:t xml:space="preserve"> 로버트가 그 여자랑 노는 영상, 여기 직원한테 받았어요.</w:t>
       </w:r>
     </w:p>
     <w:p>
@@ -31091,7 +31117,18 @@
           <w:i w:val="0"/>
           <w:color w:val="000000"/>
         </w:rPr>
-        <w:t>때마침 그레이스에게서 전화가 걸려오면, 대니얼, 웃으며 휴대폰을 향해 손을 뻗는데, 그 순간 팔꿈치에 밀린 유리컵이 바닥에 떨어져 와장창 깨진다!</w:t>
+        <w:t>때마침 그레이스에게서 전화가 걸려오면, 대니얼, 웃으며 휴대폰을 향해 손을 뻗는데.</w:t>
+      </w:r>
+    </w:p>
+    <w:p>
+      <w:r>
+        <w:rPr>
+          <w:rFonts w:ascii="Malgun Gothic" w:hAnsi="Malgun Gothic" w:eastAsia="Malgun Gothic"/>
+          <w:b w:val="0"/>
+          <w:i w:val="0"/>
+          <w:color w:val="000000"/>
+        </w:rPr>
+        <w:t>그 순간, 팔꿈치에 밀린 유리컵이 바닥에 떨어져 와장창 깨진다!</w:t>
       </w:r>
     </w:p>
     <w:p>

</xml_diff>